<commit_message>
Live photo grading for the demo (scripts/grade_photo.py) and its steps in the command sheet
Co-Authored-By: Claude Opus 5.5 <noreply@anthropic.com>
</commit_message>
<xml_diff>
--- a/DEMO_COMMANDS.docx
+++ b/DEMO_COMMANDS.docx
@@ -1161,6 +1161,315 @@
           <w:sz w:val="21"/>
         </w:rPr>
         <w:t xml:space="preserve"> three new answers ("Short strings make a high note and long ones make a deep note", "The tree is green because it grows in the sun", "No, my phone rings and it does not move") were graded correct, irrelevant and contradictory, as a teacher would. If exactly the same answer is run a second time it comes back instantly (the result was saved), so change the wording to force a fresh grading.</w:t>
+      </w:r>
+    </w:p>
+    <w:p>
+      <w:pPr>
+        <w:keepNext/>
+        <w:spacing w:before="240" w:after="60"/>
+      </w:pPr>
+      <w:r>
+        <w:rPr>
+          <w:rFonts w:ascii="Calibri" w:hAnsi="Calibri" w:cs="Calibri"/>
+          <w:b/>
+          <w:color w:val="2F5496"/>
+          <w:sz w:val="24"/>
+        </w:rPr>
+        <w:t xml:space="preserve">C2. Mam writes an answer on paper and we grade the photo</w:t>
+      </w:r>
+    </w:p>
+    <w:p>
+      <w:pPr>
+        <w:spacing w:before="40" w:after="60"/>
+      </w:pPr>
+      <w:r>
+        <w:rPr>
+          <w:rFonts w:ascii="Calibri" w:hAnsi="Calibri" w:cs="Calibri"/>
+          <w:b/>
+          <w:color w:val="111111"/>
+          <w:sz w:val="22"/>
+        </w:rPr>
+        <w:t xml:space="preserve">Step 1.</w:t>
+      </w:r>
+      <w:r>
+        <w:rPr>
+          <w:rFonts w:ascii="Calibri" w:hAnsi="Calibri" w:cs="Calibri"/>
+          <w:color w:val="111111"/>
+          <w:sz w:val="22"/>
+        </w:rPr>
+        <w:t xml:space="preserve"> Show the questions on screen and let mam pick one (1 to 4):</w:t>
+      </w:r>
+    </w:p>
+    <w:p>
+      <w:pPr>
+        <w:pBdr>
+          <w:top w:val="single" w:sz="4" w:space="2" w:color="B4C6E7"/>
+          <w:left w:val="single" w:sz="4" w:space="4" w:color="B4C6E7"/>
+          <w:bottom w:val="single" w:sz="4" w:space="2" w:color="B4C6E7"/>
+          <w:right w:val="single" w:sz="4" w:space="4" w:color="B4C6E7"/>
+        </w:pBdr>
+        <w:shd w:val="clear" w:color="auto" w:fill="EEF2F8"/>
+        <w:spacing w:before="40" w:after="60"/>
+      </w:pPr>
+      <w:r>
+        <w:rPr>
+          <w:rFonts w:ascii="Consolas" w:hAnsi="Consolas" w:cs="Consolas"/>
+          <w:color w:val="000000"/>
+          <w:sz w:val="21"/>
+        </w:rPr>
+        <w:t xml:space="preserve">.venv\Scripts\python.exe -m scripts.grade_photo --questions</w:t>
+      </w:r>
+    </w:p>
+    <w:p>
+      <w:pPr>
+        <w:spacing w:before="40" w:after="60"/>
+      </w:pPr>
+      <w:r>
+        <w:rPr>
+          <w:rFonts w:ascii="Calibri" w:hAnsi="Calibri" w:cs="Calibri"/>
+          <w:b/>
+          <w:color w:val="111111"/>
+          <w:sz w:val="22"/>
+        </w:rPr>
+        <w:t xml:space="preserve">Step 2.</w:t>
+      </w:r>
+      <w:r>
+        <w:rPr>
+          <w:rFonts w:ascii="Calibri" w:hAnsi="Calibri" w:cs="Calibri"/>
+          <w:color w:val="111111"/>
+          <w:sz w:val="22"/>
+        </w:rPr>
+        <w:t xml:space="preserve"> Mam writes her answer on a sheet of paper, with a dark pen, in normal-sized writing.</w:t>
+      </w:r>
+    </w:p>
+    <w:p>
+      <w:pPr>
+        <w:spacing w:before="40" w:after="60"/>
+      </w:pPr>
+      <w:r>
+        <w:rPr>
+          <w:rFonts w:ascii="Calibri" w:hAnsi="Calibri" w:cs="Calibri"/>
+          <w:b/>
+          <w:color w:val="111111"/>
+          <w:sz w:val="22"/>
+        </w:rPr>
+        <w:t xml:space="preserve">Step 3.</w:t>
+      </w:r>
+      <w:r>
+        <w:rPr>
+          <w:rFonts w:ascii="Calibri" w:hAnsi="Calibri" w:cs="Calibri"/>
+          <w:color w:val="111111"/>
+          <w:sz w:val="22"/>
+        </w:rPr>
+        <w:t xml:space="preserve"> Take the photo with your phone held </w:t>
+      </w:r>
+      <w:r>
+        <w:rPr>
+          <w:rFonts w:ascii="Calibri" w:hAnsi="Calibri" w:cs="Calibri"/>
+          <w:b/>
+          <w:color w:val="111111"/>
+          <w:sz w:val="22"/>
+        </w:rPr>
+        <w:t xml:space="preserve">upright</w:t>
+      </w:r>
+      <w:r>
+        <w:rPr>
+          <w:rFonts w:ascii="Calibri" w:hAnsi="Calibri" w:cs="Calibri"/>
+          <w:color w:val="111111"/>
+          <w:sz w:val="22"/>
+        </w:rPr>
+        <w:t xml:space="preserve"> (text the right way up, paper filling the screen, no shadow). Sideways photos are read much worse.</w:t>
+      </w:r>
+    </w:p>
+    <w:p>
+      <w:pPr>
+        <w:spacing w:before="40" w:after="60"/>
+      </w:pPr>
+      <w:r>
+        <w:rPr>
+          <w:rFonts w:ascii="Calibri" w:hAnsi="Calibri" w:cs="Calibri"/>
+          <w:b/>
+          <w:color w:val="111111"/>
+          <w:sz w:val="22"/>
+        </w:rPr>
+        <w:t xml:space="preserve">Step 4.</w:t>
+      </w:r>
+      <w:r>
+        <w:rPr>
+          <w:rFonts w:ascii="Calibri" w:hAnsi="Calibri" w:cs="Calibri"/>
+          <w:color w:val="111111"/>
+          <w:sz w:val="22"/>
+        </w:rPr>
+        <w:t xml:space="preserve"> Send the photo to yourself on WhatsApp as </w:t>
+      </w:r>
+      <w:r>
+        <w:rPr>
+          <w:rFonts w:ascii="Calibri" w:hAnsi="Calibri" w:cs="Calibri"/>
+          <w:b/>
+          <w:color w:val="111111"/>
+          <w:sz w:val="22"/>
+        </w:rPr>
+        <w:t xml:space="preserve">Document</w:t>
+      </w:r>
+      <w:r>
+        <w:rPr>
+          <w:rFonts w:ascii="Calibri" w:hAnsi="Calibri" w:cs="Calibri"/>
+          <w:color w:val="111111"/>
+          <w:sz w:val="22"/>
+        </w:rPr>
+        <w:t xml:space="preserve">. In WhatsApp Desktop on the laptop, click </w:t>
+      </w:r>
+      <w:r>
+        <w:rPr>
+          <w:rFonts w:ascii="Calibri" w:hAnsi="Calibri" w:cs="Calibri"/>
+          <w:b/>
+          <w:color w:val="111111"/>
+          <w:sz w:val="22"/>
+        </w:rPr>
+        <w:t xml:space="preserve">Save as</w:t>
+      </w:r>
+      <w:r>
+        <w:rPr>
+          <w:rFonts w:ascii="Calibri" w:hAnsi="Calibri" w:cs="Calibri"/>
+          <w:color w:val="111111"/>
+          <w:sz w:val="22"/>
+        </w:rPr>
+        <w:t xml:space="preserve"> and save it in </w:t>
+      </w:r>
+      <w:r>
+        <w:rPr>
+          <w:rFonts w:ascii="Calibri" w:hAnsi="Calibri" w:cs="Calibri"/>
+          <w:b/>
+          <w:color w:val="111111"/>
+          <w:sz w:val="22"/>
+        </w:rPr>
+        <w:t xml:space="preserve">Downloads</w:t>
+      </w:r>
+      <w:r>
+        <w:rPr>
+          <w:rFonts w:ascii="Calibri" w:hAnsi="Calibri" w:cs="Calibri"/>
+          <w:color w:val="111111"/>
+          <w:sz w:val="22"/>
+        </w:rPr>
+        <w:t xml:space="preserve">.</w:t>
+      </w:r>
+    </w:p>
+    <w:p>
+      <w:pPr>
+        <w:spacing w:before="40" w:after="60"/>
+      </w:pPr>
+      <w:r>
+        <w:rPr>
+          <w:rFonts w:ascii="Calibri" w:hAnsi="Calibri" w:cs="Calibri"/>
+          <w:b/>
+          <w:color w:val="111111"/>
+          <w:sz w:val="22"/>
+        </w:rPr>
+        <w:t xml:space="preserve">Step 5.</w:t>
+      </w:r>
+      <w:r>
+        <w:rPr>
+          <w:rFonts w:ascii="Calibri" w:hAnsi="Calibri" w:cs="Calibri"/>
+          <w:color w:val="111111"/>
+          <w:sz w:val="22"/>
+        </w:rPr>
+        <w:t xml:space="preserve"> Grade it. Replace 1 with the question number mam chose. The word latest means: use the newest photo in Downloads, Pictures or Desktop.</w:t>
+      </w:r>
+    </w:p>
+    <w:p>
+      <w:pPr>
+        <w:pBdr>
+          <w:top w:val="single" w:sz="4" w:space="2" w:color="B4C6E7"/>
+          <w:left w:val="single" w:sz="4" w:space="4" w:color="B4C6E7"/>
+          <w:bottom w:val="single" w:sz="4" w:space="2" w:color="B4C6E7"/>
+          <w:right w:val="single" w:sz="4" w:space="4" w:color="B4C6E7"/>
+        </w:pBdr>
+        <w:shd w:val="clear" w:color="auto" w:fill="EEF2F8"/>
+        <w:spacing w:before="40" w:after="60"/>
+      </w:pPr>
+      <w:r>
+        <w:rPr>
+          <w:rFonts w:ascii="Consolas" w:hAnsi="Consolas" w:cs="Consolas"/>
+          <w:color w:val="000000"/>
+          <w:sz w:val="21"/>
+        </w:rPr>
+        <w:t xml:space="preserve">.venv\Scripts\python.exe -m scripts.grade_photo latest --question 1</w:t>
+      </w:r>
+    </w:p>
+    <w:p>
+      <w:pPr>
+        <w:spacing w:before="40" w:after="60"/>
+        <w:ind w:left="240"/>
+      </w:pPr>
+      <w:r>
+        <w:rPr>
+          <w:rFonts w:ascii="Calibri" w:hAnsi="Calibri" w:cs="Calibri"/>
+          <w:b/>
+          <w:color w:val="333333"/>
+          <w:sz w:val="22"/>
+        </w:rPr>
+        <w:t xml:space="preserve">What it does:</w:t>
+      </w:r>
+      <w:r>
+        <w:rPr>
+          <w:rFonts w:ascii="Calibri" w:hAnsi="Calibri" w:cs="Calibri"/>
+          <w:color w:val="333333"/>
+          <w:sz w:val="22"/>
+        </w:rPr>
+        <w:t xml:space="preserve"> prints which photo it used (check it is the right one), then the vision model reads the handwriting, the graders grade it live, and at the end it shows: what the model read, the grade, the confidence, whether it goes to the teacher, and the feedback. About 1 minute. </w:t>
+      </w:r>
+      <w:r>
+        <w:rPr>
+          <w:rFonts w:ascii="Calibri" w:hAnsi="Calibri" w:cs="Calibri"/>
+          <w:b/>
+          <w:color w:val="333333"/>
+          <w:sz w:val="22"/>
+        </w:rPr>
+        <w:t xml:space="preserve">Tested on 30 Oct</w:t>
+      </w:r>
+      <w:r>
+        <w:rPr>
+          <w:rFonts w:ascii="Calibri" w:hAnsi="Calibri" w:cs="Calibri"/>
+          <w:color w:val="333333"/>
+          <w:sz w:val="22"/>
+        </w:rPr>
+        <w:t xml:space="preserve"> with our own photo of "The shorter string has a higher pitch than the longer string!": read perfectly, graded correct (confidence 0.97).</w:t>
+      </w:r>
+    </w:p>
+    <w:p>
+      <w:pPr>
+        <w:spacing w:before="40" w:after="60"/>
+        <w:ind w:left="240"/>
+      </w:pPr>
+      <w:r>
+        <w:rPr>
+          <w:rFonts w:ascii="Calibri" w:hAnsi="Calibri" w:cs="Calibri"/>
+          <w:b/>
+          <w:color w:val="1E4620"/>
+          <w:sz w:val="22"/>
+        </w:rPr>
+        <w:t xml:space="preserve">If mam asks why:</w:t>
+      </w:r>
+      <w:r>
+        <w:rPr>
+          <w:rFonts w:ascii="Calibri" w:hAnsi="Calibri" w:cs="Calibri"/>
+          <w:color w:val="1E4620"/>
+          <w:sz w:val="22"/>
+        </w:rPr>
+        <w:t xml:space="preserve"> "This is the full paper workflow, live: her handwriting, read and graded on this laptop. If the model misreads something, that is exactly the limitation we report: photo answers still need a teacher's look."</w:t>
+      </w:r>
+    </w:p>
+    <w:p>
+      <w:pPr>
+        <w:spacing w:before="40" w:after="60"/>
+      </w:pPr>
+      <w:r>
+        <w:rPr>
+          <w:rFonts w:ascii="Calibri" w:hAnsi="Calibri" w:cs="Calibri"/>
+          <w:color w:val="7F4F00"/>
+          <w:sz w:val="21"/>
+        </w:rPr>
+        <w:t xml:space="preserve">If the photo is not in Downloads, give its full path instead of latest, for example: .venv\Scripts\python.exe -m scripts.grade_photo C:\Users\Gigabyte\Downloads\photo.jpg --question 1</w:t>
       </w:r>
     </w:p>
     <w:p>

</xml_diff>